<commit_message>
Add image support: extract content images from PDF, embed and render them
model.py gains an ImageBlock; import_pdf extracts raster content images (skipping
logo/header/footer/backgrounds) and embeds them in the .docx in reading order;
generator renders them scaled to fit the content frame (width and height capped).

https://claude.ai/code/session_01W3gw8scX9B7oMC33JPxjbS
</commit_message>
<xml_diff>
--- a/policies/sources/responsible-sourcing-policy__Policy.docx
+++ b/policies/sources/responsible-sourcing-policy__Policy.docx
@@ -2,6 +2,294 @@
 <file path=word/document.xml><?xml version="1.0" encoding="utf-8"?>
 <w:document xmlns:wpc="http://schemas.microsoft.com/office/word/2010/wordprocessingCanvas" xmlns:mo="http://schemas.microsoft.com/office/mac/office/2008/main" xmlns:mc="http://schemas.openxmlformats.org/markup-compatibility/2006" xmlns:mv="urn:schemas-microsoft-com:mac:vml" xmlns:o="urn:schemas-microsoft-com:office:office" xmlns:r="http://schemas.openxmlformats.org/officeDocument/2006/relationships" xmlns:m="http://schemas.openxmlformats.org/officeDocument/2006/math" xmlns:v="urn:schemas-microsoft-com:vml" xmlns:wp14="http://schemas.microsoft.com/office/word/2010/wordprocessingDrawing" xmlns:wp="http://schemas.openxmlformats.org/drawingml/2006/wordprocessingDrawing" xmlns:w10="urn:schemas-microsoft-com:office:word" xmlns:w="http://schemas.openxmlformats.org/wordprocessingml/2006/main" xmlns:w14="http://schemas.microsoft.com/office/word/2010/wordml" xmlns:wpg="http://schemas.microsoft.com/office/word/2010/wordprocessingGroup" xmlns:wpi="http://schemas.microsoft.com/office/word/2010/wordprocessingInk" xmlns:wne="http://schemas.microsoft.com/office/word/2006/wordml" xmlns:wps="http://schemas.microsoft.com/office/word/2010/wordprocessingShape" mc:Ignorable="w14 wp14">
   <w:body>
+    <w:p>
+      <w:r>
+        <w:drawing>
+          <wp:inline xmlns:a="http://schemas.openxmlformats.org/drawingml/2006/main" xmlns:pic="http://schemas.openxmlformats.org/drawingml/2006/picture">
+            <wp:extent cx="1099963" cy="3068319"/>
+            <wp:docPr id="1" name="Picture 1"/>
+            <wp:cNvGraphicFramePr>
+              <a:graphicFrameLocks noChangeAspect="1"/>
+            </wp:cNvGraphicFramePr>
+            <a:graphic>
+              <a:graphicData uri="http://schemas.openxmlformats.org/drawingml/2006/picture">
+                <pic:pic>
+                  <pic:nvPicPr>
+                    <pic:cNvPr id="0" name="image.png"/>
+                    <pic:cNvPicPr/>
+                  </pic:nvPicPr>
+                  <pic:blipFill>
+                    <a:blip r:embed="rId9"/>
+                    <a:stretch>
+                      <a:fillRect/>
+                    </a:stretch>
+                  </pic:blipFill>
+                  <pic:spPr>
+                    <a:xfrm>
+                      <a:off x="0" y="0"/>
+                      <a:ext cx="1099963" cy="3068319"/>
+                    </a:xfrm>
+                    <a:prstGeom prst="rect"/>
+                  </pic:spPr>
+                </pic:pic>
+              </a:graphicData>
+            </a:graphic>
+          </wp:inline>
+        </w:drawing>
+      </w:r>
+    </w:p>
+    <w:p>
+      <w:r>
+        <w:drawing>
+          <wp:inline xmlns:a="http://schemas.openxmlformats.org/drawingml/2006/main" xmlns:pic="http://schemas.openxmlformats.org/drawingml/2006/picture">
+            <wp:extent cx="1099440" cy="3063813"/>
+            <wp:docPr id="2" name="Picture 2"/>
+            <wp:cNvGraphicFramePr>
+              <a:graphicFrameLocks noChangeAspect="1"/>
+            </wp:cNvGraphicFramePr>
+            <a:graphic>
+              <a:graphicData uri="http://schemas.openxmlformats.org/drawingml/2006/picture">
+                <pic:pic>
+                  <pic:nvPicPr>
+                    <pic:cNvPr id="0" name="image.png"/>
+                    <pic:cNvPicPr/>
+                  </pic:nvPicPr>
+                  <pic:blipFill>
+                    <a:blip r:embed="rId10"/>
+                    <a:stretch>
+                      <a:fillRect/>
+                    </a:stretch>
+                  </pic:blipFill>
+                  <pic:spPr>
+                    <a:xfrm>
+                      <a:off x="0" y="0"/>
+                      <a:ext cx="1099440" cy="3063813"/>
+                    </a:xfrm>
+                    <a:prstGeom prst="rect"/>
+                  </pic:spPr>
+                </pic:pic>
+              </a:graphicData>
+            </a:graphic>
+          </wp:inline>
+        </w:drawing>
+      </w:r>
+    </w:p>
+    <w:p>
+      <w:r>
+        <w:drawing>
+          <wp:inline xmlns:a="http://schemas.openxmlformats.org/drawingml/2006/main" xmlns:pic="http://schemas.openxmlformats.org/drawingml/2006/picture">
+            <wp:extent cx="1098746" cy="3043618"/>
+            <wp:docPr id="3" name="Picture 3"/>
+            <wp:cNvGraphicFramePr>
+              <a:graphicFrameLocks noChangeAspect="1"/>
+            </wp:cNvGraphicFramePr>
+            <a:graphic>
+              <a:graphicData uri="http://schemas.openxmlformats.org/drawingml/2006/picture">
+                <pic:pic>
+                  <pic:nvPicPr>
+                    <pic:cNvPr id="0" name="image.png"/>
+                    <pic:cNvPicPr/>
+                  </pic:nvPicPr>
+                  <pic:blipFill>
+                    <a:blip r:embed="rId11"/>
+                    <a:stretch>
+                      <a:fillRect/>
+                    </a:stretch>
+                  </pic:blipFill>
+                  <pic:spPr>
+                    <a:xfrm>
+                      <a:off x="0" y="0"/>
+                      <a:ext cx="1098746" cy="3043618"/>
+                    </a:xfrm>
+                    <a:prstGeom prst="rect"/>
+                  </pic:spPr>
+                </pic:pic>
+              </a:graphicData>
+            </a:graphic>
+          </wp:inline>
+        </w:drawing>
+      </w:r>
+    </w:p>
+    <w:p>
+      <w:r>
+        <w:drawing>
+          <wp:inline xmlns:a="http://schemas.openxmlformats.org/drawingml/2006/main" xmlns:pic="http://schemas.openxmlformats.org/drawingml/2006/picture">
+            <wp:extent cx="1097901" cy="3059525"/>
+            <wp:docPr id="4" name="Picture 4"/>
+            <wp:cNvGraphicFramePr>
+              <a:graphicFrameLocks noChangeAspect="1"/>
+            </wp:cNvGraphicFramePr>
+            <a:graphic>
+              <a:graphicData uri="http://schemas.openxmlformats.org/drawingml/2006/picture">
+                <pic:pic>
+                  <pic:nvPicPr>
+                    <pic:cNvPr id="0" name="image.png"/>
+                    <pic:cNvPicPr/>
+                  </pic:nvPicPr>
+                  <pic:blipFill>
+                    <a:blip r:embed="rId12"/>
+                    <a:stretch>
+                      <a:fillRect/>
+                    </a:stretch>
+                  </pic:blipFill>
+                  <pic:spPr>
+                    <a:xfrm>
+                      <a:off x="0" y="0"/>
+                      <a:ext cx="1097901" cy="3059525"/>
+                    </a:xfrm>
+                    <a:prstGeom prst="rect"/>
+                  </pic:spPr>
+                </pic:pic>
+              </a:graphicData>
+            </a:graphic>
+          </wp:inline>
+        </w:drawing>
+      </w:r>
+    </w:p>
+    <w:p>
+      <w:r>
+        <w:drawing>
+          <wp:inline xmlns:a="http://schemas.openxmlformats.org/drawingml/2006/main" xmlns:pic="http://schemas.openxmlformats.org/drawingml/2006/picture">
+            <wp:extent cx="1098060" cy="3059968"/>
+            <wp:docPr id="5" name="Picture 5"/>
+            <wp:cNvGraphicFramePr>
+              <a:graphicFrameLocks noChangeAspect="1"/>
+            </wp:cNvGraphicFramePr>
+            <a:graphic>
+              <a:graphicData uri="http://schemas.openxmlformats.org/drawingml/2006/picture">
+                <pic:pic>
+                  <pic:nvPicPr>
+                    <pic:cNvPr id="0" name="image.png"/>
+                    <pic:cNvPicPr/>
+                  </pic:nvPicPr>
+                  <pic:blipFill>
+                    <a:blip r:embed="rId13"/>
+                    <a:stretch>
+                      <a:fillRect/>
+                    </a:stretch>
+                  </pic:blipFill>
+                  <pic:spPr>
+                    <a:xfrm>
+                      <a:off x="0" y="0"/>
+                      <a:ext cx="1098060" cy="3059968"/>
+                    </a:xfrm>
+                    <a:prstGeom prst="rect"/>
+                  </pic:spPr>
+                </pic:pic>
+              </a:graphicData>
+            </a:graphic>
+          </wp:inline>
+        </w:drawing>
+      </w:r>
+    </w:p>
+    <w:p>
+      <w:r>
+        <w:drawing>
+          <wp:inline xmlns:a="http://schemas.openxmlformats.org/drawingml/2006/main" xmlns:pic="http://schemas.openxmlformats.org/drawingml/2006/picture">
+            <wp:extent cx="1098711" cy="3034390"/>
+            <wp:docPr id="6" name="Picture 6"/>
+            <wp:cNvGraphicFramePr>
+              <a:graphicFrameLocks noChangeAspect="1"/>
+            </wp:cNvGraphicFramePr>
+            <a:graphic>
+              <a:graphicData uri="http://schemas.openxmlformats.org/drawingml/2006/picture">
+                <pic:pic>
+                  <pic:nvPicPr>
+                    <pic:cNvPr id="0" name="image.png"/>
+                    <pic:cNvPicPr/>
+                  </pic:nvPicPr>
+                  <pic:blipFill>
+                    <a:blip r:embed="rId14"/>
+                    <a:stretch>
+                      <a:fillRect/>
+                    </a:stretch>
+                  </pic:blipFill>
+                  <pic:spPr>
+                    <a:xfrm>
+                      <a:off x="0" y="0"/>
+                      <a:ext cx="1098711" cy="3034390"/>
+                    </a:xfrm>
+                    <a:prstGeom prst="rect"/>
+                  </pic:spPr>
+                </pic:pic>
+              </a:graphicData>
+            </a:graphic>
+          </wp:inline>
+        </w:drawing>
+      </w:r>
+    </w:p>
+    <w:p>
+      <w:r>
+        <w:drawing>
+          <wp:inline xmlns:a="http://schemas.openxmlformats.org/drawingml/2006/main" xmlns:pic="http://schemas.openxmlformats.org/drawingml/2006/picture">
+            <wp:extent cx="1098614" cy="3034122"/>
+            <wp:docPr id="7" name="Picture 7"/>
+            <wp:cNvGraphicFramePr>
+              <a:graphicFrameLocks noChangeAspect="1"/>
+            </wp:cNvGraphicFramePr>
+            <a:graphic>
+              <a:graphicData uri="http://schemas.openxmlformats.org/drawingml/2006/picture">
+                <pic:pic>
+                  <pic:nvPicPr>
+                    <pic:cNvPr id="0" name="image.png"/>
+                    <pic:cNvPicPr/>
+                  </pic:nvPicPr>
+                  <pic:blipFill>
+                    <a:blip r:embed="rId15"/>
+                    <a:stretch>
+                      <a:fillRect/>
+                    </a:stretch>
+                  </pic:blipFill>
+                  <pic:spPr>
+                    <a:xfrm>
+                      <a:off x="0" y="0"/>
+                      <a:ext cx="1098614" cy="3034122"/>
+                    </a:xfrm>
+                    <a:prstGeom prst="rect"/>
+                  </pic:spPr>
+                </pic:pic>
+              </a:graphicData>
+            </a:graphic>
+          </wp:inline>
+        </w:drawing>
+      </w:r>
+    </w:p>
+    <w:p>
+      <w:r>
+        <w:drawing>
+          <wp:inline xmlns:a="http://schemas.openxmlformats.org/drawingml/2006/main" xmlns:pic="http://schemas.openxmlformats.org/drawingml/2006/picture">
+            <wp:extent cx="1098096" cy="3038066"/>
+            <wp:docPr id="8" name="Picture 8"/>
+            <wp:cNvGraphicFramePr>
+              <a:graphicFrameLocks noChangeAspect="1"/>
+            </wp:cNvGraphicFramePr>
+            <a:graphic>
+              <a:graphicData uri="http://schemas.openxmlformats.org/drawingml/2006/picture">
+                <pic:pic>
+                  <pic:nvPicPr>
+                    <pic:cNvPr id="0" name="image.png"/>
+                    <pic:cNvPicPr/>
+                  </pic:nvPicPr>
+                  <pic:blipFill>
+                    <a:blip r:embed="rId16"/>
+                    <a:stretch>
+                      <a:fillRect/>
+                    </a:stretch>
+                  </pic:blipFill>
+                  <pic:spPr>
+                    <a:xfrm>
+                      <a:off x="0" y="0"/>
+                      <a:ext cx="1098096" cy="3038066"/>
+                    </a:xfrm>
+                    <a:prstGeom prst="rect"/>
+                  </pic:spPr>
+                </pic:pic>
+              </a:graphicData>
+            </a:graphic>
+          </wp:inline>
+        </w:drawing>
+      </w:r>
+    </w:p>
     <w:p>
       <w:r>
         <w:t>responsible sourcing of raw materials.</w:t>

</xml_diff>